<commit_message>
feat(oos-262098): include dual positive samples and separate organisms with blank line in Table 2
</commit_message>
<xml_diff>
--- a/scratch/OOS-262098 Solyn LLC (E75000) - Phase II.docx
+++ b/scratch/OOS-262098 Solyn LLC (E75000) - Phase II.docx
@@ -431,19 +431,19 @@
               </w:rPr>
               <w:t xml:space="preserve">Prepping Analyst:</w:t>
               <w:br/>
-              <w:t xml:space="preserve">Andrew Carrillo (AC)</w:t>
+              <w:t xml:space="preserve">Alex Saravia (ES), Andrew Carrillo (AC)</w:t>
               <w:br/>
               <w:t xml:space="preserve"/>
               <w:br/>
               <w:t xml:space="preserve">Processing Analyst:</w:t>
               <w:br/>
-              <w:t xml:space="preserve">Abayomi Odugbesi (AO)</w:t>
+              <w:t xml:space="preserve">Alex Saravia (ES), Abayomi Odugbesi (AO)</w:t>
               <w:br/>
               <w:t xml:space="preserve"/>
               <w:br/>
               <w:t xml:space="preserve">Reading Analyst:</w:t>
               <w:br/>
-              <w:t xml:space="preserve">Andrew Carrillo (AC)</w:t>
+              <w:t xml:space="preserve">Elysse Nioupin (EN), Andrew Carrillo (AC)</w:t>
             </w:r>
           </w:p>
           <w:p>
@@ -9944,9 +9944,13 @@
         </w:tc>
       </w:tr>
       <w:tr>
+        <w:trPr>
+          <w:trHeight w:val="220" w:hRule="atLeast"/>
+        </w:trPr>
         <w:tc>
           <w:tcPr>
             <w:tcW w:type="dxa" w:w="1550"/>
+            <w:vAlign w:val="center"/>
           </w:tcPr>
           <w:p>
             <w:pPr>
@@ -9960,9 +9964,9 @@
             </w:pPr>
             <w:r>
               <w:rPr>
-                <w:rFonts w:ascii="Times New Roman" w:hAnsi="Times New Roman"/>
-                <w:sz w:val="14"/>
-                <w:szCs w:val="14"/>
+                <w:sz w:val="14"/>
+                <w:szCs w:val="14"/>
+                <w:rFonts w:ascii="Times New Roman" w:hAnsi="Times New Roman" w:cs="Times New Roman"/>
               </w:rPr>
               <w:t>Abayomi Odugbesi</w:t>
             </w:r>
@@ -9971,6 +9975,7 @@
         <w:tc>
           <w:tcPr>
             <w:tcW w:type="dxa" w:w="1550"/>
+            <w:vAlign w:val="center"/>
           </w:tcPr>
           <w:p>
             <w:pPr>
@@ -9984,9 +9989,9 @@
             </w:pPr>
             <w:r>
               <w:rPr>
-                <w:rFonts w:ascii="Times New Roman" w:hAnsi="Times New Roman"/>
-                <w:sz w:val="14"/>
-                <w:szCs w:val="14"/>
+                <w:sz w:val="14"/>
+                <w:szCs w:val="14"/>
+                <w:rFonts w:ascii="Times New Roman" w:hAnsi="Times New Roman" w:cs="Times New Roman"/>
               </w:rPr>
               <w:t>Andrew Carrillo</w:t>
             </w:r>
@@ -9995,6 +10000,7 @@
         <w:tc>
           <w:tcPr>
             <w:tcW w:type="dxa" w:w="1400"/>
+            <w:vAlign w:val="center"/>
           </w:tcPr>
           <w:p>
             <w:pPr>
@@ -10006,14 +10012,14 @@
                 <w:szCs w:val="14"/>
               </w:rPr>
             </w:pPr>
-            <w:hyperlink r:id="rId10">
+            <w:hyperlink r:id="rId9" w:history="1">
               <w:r>
                 <w:rPr>
                   <w:rFonts w:ascii="Times New Roman" w:hAnsi="Times New Roman"/>
                   <w:color w:val="0000FF"/>
-                  <w:u w:val="single"/>
                   <w:sz w:val="14"/>
                   <w:szCs w:val="14"/>
+                  <w:u w:val="single"/>
                 </w:rPr>
                 <w:t>ETX-260914-0470</w:t>
               </w:r>
@@ -10023,6 +10029,7 @@
         <w:tc>
           <w:tcPr>
             <w:tcW w:type="dxa" w:w="1400"/>
+            <w:vAlign w:val="center"/>
           </w:tcPr>
           <w:p>
             <w:pPr>
@@ -10034,14 +10041,14 @@
                 <w:szCs w:val="14"/>
               </w:rPr>
             </w:pPr>
-            <w:hyperlink r:id="rId11">
+            <w:hyperlink r:id="rId10" w:history="1">
               <w:r>
                 <w:rPr>
                   <w:rFonts w:ascii="Times New Roman" w:hAnsi="Times New Roman"/>
                   <w:color w:val="0000FF"/>
-                  <w:u w:val="single"/>
                   <w:sz w:val="14"/>
                   <w:szCs w:val="14"/>
+                  <w:u w:val="single"/>
                 </w:rPr>
                 <w:t>ETX-260921-0498</w:t>
               </w:r>
@@ -10051,6 +10058,7 @@
         <w:tc>
           <w:tcPr>
             <w:tcW w:type="dxa" w:w="1540"/>
+            <w:vAlign w:val="center"/>
           </w:tcPr>
           <w:p>
             <w:pPr>
@@ -10064,9 +10072,9 @@
             </w:pPr>
             <w:r>
               <w:rPr>
-                <w:rFonts w:ascii="Times New Roman" w:hAnsi="Times New Roman"/>
-                <w:sz w:val="14"/>
-                <w:szCs w:val="14"/>
+                <w:sz w:val="14"/>
+                <w:szCs w:val="14"/>
+                <w:rFonts w:ascii="Times New Roman" w:hAnsi="Times New Roman" w:cs="Times New Roman"/>
               </w:rPr>
               <w:t>1 x 100mL TSB bottle</w:t>
             </w:r>
@@ -10075,6 +10083,7 @@
         <w:tc>
           <w:tcPr>
             <w:tcW w:type="dxa" w:w="1900"/>
+            <w:vAlign w:val="center"/>
           </w:tcPr>
           <w:p>
             <w:pPr>
@@ -10088,23 +10097,21 @@
             </w:pPr>
             <w:r>
               <w:rPr>
-                <w:rFonts w:ascii="Times New Roman" w:hAnsi="Times New Roman"/>
                 <w:i/>
                 <w:iCs/>
                 <w:sz w:val="14"/>
                 <w:szCs w:val="14"/>
+                <w:rFonts w:ascii="Times New Roman" w:hAnsi="Times New Roman" w:cs="Times New Roman"/>
               </w:rPr>
               <w:t>Microbacterium sp. PM5</w:t>
             </w:r>
             <w:r>
+              <w:rPr>
+                <w:sz w:val="14"/>
+                <w:szCs w:val="14"/>
+                <w:rFonts w:ascii="Times New Roman" w:hAnsi="Times New Roman" w:cs="Times New Roman"/>
+              </w:rPr>
               <w:br/>
-            </w:r>
-            <w:r>
-              <w:rPr>
-                <w:rFonts w:ascii="Times New Roman" w:hAnsi="Times New Roman"/>
-                <w:sz w:val="14"/>
-                <w:szCs w:val="14"/>
-              </w:rPr>
               <w:t>(Gram (+) short rods)</w:t>
             </w:r>
           </w:p>
@@ -14414,7 +14421,7 @@
                 <w:szCs w:val="14"/>
               </w:rPr>
             </w:pPr>
-            <w:hyperlink r:id="rId9" w:history="1">
+            <w:hyperlink r:id="rId11" w:history="1">
               <w:r>
                 <w:rPr>
                   <w:rFonts w:ascii="Times New Roman" w:hAnsi="Times New Roman"/>
@@ -14460,6 +14467,17 @@
               </w:rPr>
               <w:t>Corynebacterium ureicelerivorans</w:t>
             </w:r>
+          </w:p>
+          <w:p>
+            <w:pPr>
+              <w:jc w:val="center"/>
+              <w:spacing w:before="0" w:after="0" w:line="120" w:lineRule="auto"/>
+              <w:rPr>
+                <w:rFonts w:ascii="Times New Roman" w:hAnsi="Times New Roman"/>
+                <w:sz w:val="13"/>
+                <w:szCs w:val="13"/>
+              </w:rPr>
+            </w:pPr>
           </w:p>
           <w:p>
             <w:pPr>

</xml_diff>

<commit_message>
fix(analyst-roster): correct Ayomide Odugbesi (AOD) and Alex Saravia (ES) across OOS-262098
</commit_message>
<xml_diff>
--- a/scratch/OOS-262098 Solyn LLC (E75000) - Phase II.docx
+++ b/scratch/OOS-262098 Solyn LLC (E75000) - Phase II.docx
@@ -437,7 +437,7 @@
               <w:br/>
               <w:t xml:space="preserve">Processing Analyst:</w:t>
               <w:br/>
-              <w:t xml:space="preserve">Abayomi Odugbesi (AOD)</w:t>
+              <w:t xml:space="preserve">Ayomide Odugbesi (AOD)</w:t>
               <w:br/>
               <w:t xml:space="preserve"/>
               <w:br/>
@@ -6356,7 +6356,7 @@
                 <w:rFonts w:ascii="Times New Roman" w:hAnsi="Times New Roman"/>
                 <w:szCs w:val="20"/>
               </w:rPr>
-              <w:t xml:space="preserve">All the analysts involved in the testing - the initial prepping analyst (Ishita Sharma), the initial processing analyst (Alex Saravia), the initial reading analyst (Elysse Nioupin), the retest prepping and reading analyst (Andrew Carrillo), and the retest processing analyst (Abayomi Odugbesi) - were interviewed comprehensively. Their answers are recorded throughout this document. This investigation was performed in accordance with MICRO-SOP-53, Sterility Test Out-of-Specification Investigation Procedure.</w:t>
+              <w:t xml:space="preserve">All the analysts involved in the testing - the initial prepping analyst (Ishita Sharma), the initial processing analyst (Alex Saravia), the initial reading analyst (Elysse Nioupin), the retest prepping and reading analyst (Andrew Carrillo), and the retest processing analyst (Ayomide Odugbesi) - were interviewed comprehensively. Their answers are recorded throughout this document. This investigation was performed in accordance with MICRO-SOP-53, Sterility Test Out-of-Specification Investigation Procedure.</w:t>
               <w:br/>
               <w:t xml:space="preserve"/>
               <w:br/>
@@ -6674,7 +6674,7 @@
               <w:br/>
               <w:t xml:space="preserve"/>
               <w:br/>
-              <w:t xml:space="preserve">The retest sample was prepared by Andrew Carrillo on 14Sep26 and processed by Abayomi Odugbesi on 15Sep26 in accordance with MICRO-SOP-5 (USP 71&gt; / EP 2.6.1 Sterility Test) via membrane filtration (60 gm filtered across 4 vials). The retest was conducted in certified ISO 5 BSC E001314 within Cleanroom Suite 115 following standard multi-barrier disinfection and strict aseptic technique. All culture media (FTM Lot 2567320, TSB Lot 2567280) and reagents (Fluid D Lot 687774, Bacteriostatic Water Lot NM7681) were within valid expiration dates. Media bottles were incubated in designated incubators E001356 and E001357. Negative controls were handled concurrently and remained sterile.</w:t>
+              <w:t xml:space="preserve">The retest sample was prepared by Andrew Carrillo on 14Sep26 and processed by Ayomide Odugbesi on 15Sep26 in accordance with MICRO-SOP-5 (USP 71&gt; / EP 2.6.1 Sterility Test) via membrane filtration (60 gm filtered across 4 vials). The retest was conducted in certified ISO 5 BSC E001314 within Cleanroom Suite 115 following standard multi-barrier disinfection and strict aseptic technique. All culture media (FTM Lot 2567320, TSB Lot 2567280) and reagents (Fluid D Lot 687774, Bacteriostatic Water Lot NM7681) were within valid expiration dates. Media bottles were incubated in designated incubators E001356 and E001357. Negative controls were handled concurrently and remained sterile.</w:t>
               <w:br/>
               <w:t xml:space="preserve"/>
               <w:br/>
@@ -6688,7 +6688,7 @@
               <w:br/>
               <w:t xml:space="preserve">EVALUATION OF RETEST FINDINGS  JUSTIFICATION OF PRIOR SCANRDI RESULT:</w:t>
               <w:br/>
-              <w:t xml:space="preserve">The replication of microbial recovery in the independent retest—conducted by a different processing analyst (Abayomi Odugbesi) in a different cleanroom suite (Cleanroom Suite 115 vs. Suite 114) and a different prepping/reading analyst (Andrew Carrillo)—conclusively confirms that the microbial recovery was not an isolated laboratory anomaly, as the identical microorganism (Microbacterium sp. PM5) was recovered on the identical incubation day (Day 6) in the same media type (TSB) in both tests.</w:t>
+              <w:t xml:space="preserve">The replication of microbial recovery in the independent retest—conducted by a different processing analyst (Ayomide Odugbesi) in a different cleanroom suite (Cleanroom Suite 115 vs. Suite 114) and a different prepping/reading analyst (Andrew Carrillo)—conclusively confirms that the microbial recovery was not an isolated laboratory anomaly, as the identical microorganism (Microbacterium sp. PM5) was recovered on the identical incubation day (Day 6) in the same media type (TSB) in both tests.</w:t>
               <w:br/>
               <w:t xml:space="preserve"/>
               <w:br/>
@@ -10081,7 +10081,7 @@
                 <w:szCs w:val="14"/>
                 <w:rFonts w:ascii="Times New Roman" w:hAnsi="Times New Roman" w:cs="Times New Roman"/>
               </w:rPr>
-              <w:t>Abayomi Odugbesi</w:t>
+              <w:t>Ayomide Odugbesi</w:t>
             </w:r>
           </w:p>
         </w:tc>
@@ -10834,7 +10834,7 @@
                 <w:szCs w:val="14"/>
                 <w:rFonts w:ascii="Times New Roman" w:hAnsi="Times New Roman" w:cs="Times New Roman"/>
               </w:rPr>
-              <w:t w:space="preserve" xml:space="preserve">AS</w:t>
+              <w:t w:space="preserve" xml:space="preserve">ES</w:t>
             </w:r>
           </w:p>
         </w:tc>
@@ -11223,7 +11223,7 @@
                 <w:szCs w:val="14"/>
                 <w:rFonts w:ascii="Times New Roman" w:hAnsi="Times New Roman" w:cs="Times New Roman"/>
               </w:rPr>
-              <w:t w:space="preserve" xml:space="preserve">AS </w:t>
+              <w:t w:space="preserve" xml:space="preserve">ES </w:t>
             </w:r>
             <w:r>
               <w:rPr>
@@ -11601,7 +11601,7 @@
                 <w:szCs w:val="14"/>
                 <w:rFonts w:ascii="Times New Roman" w:hAnsi="Times New Roman" w:cs="Times New Roman"/>
               </w:rPr>
-              <w:t w:space="preserve" xml:space="preserve">AS </w:t>
+              <w:t w:space="preserve" xml:space="preserve">ES </w:t>
             </w:r>
             <w:r>
               <w:rPr>
@@ -12045,7 +12045,7 @@
                 <w:szCs w:val="14"/>
                 <w:rFonts w:ascii="Times New Roman" w:hAnsi="Times New Roman" w:cs="Times New Roman"/>
               </w:rPr>
-              <w:t w:space="preserve" xml:space="preserve">AS</w:t>
+              <w:t w:space="preserve" xml:space="preserve">ES</w:t>
             </w:r>
           </w:p>
         </w:tc>
@@ -12483,7 +12483,7 @@
                 <w:szCs w:val="14"/>
                 <w:rFonts w:ascii="Times New Roman" w:hAnsi="Times New Roman" w:cs="Times New Roman"/>
               </w:rPr>
-              <w:t w:space="preserve" xml:space="preserve">AS </w:t>
+              <w:t w:space="preserve" xml:space="preserve">ES </w:t>
             </w:r>
             <w:r>
               <w:rPr>
@@ -12878,7 +12878,7 @@
                 <w:szCs w:val="14"/>
                 <w:rFonts w:ascii="Times New Roman" w:hAnsi="Times New Roman" w:cs="Times New Roman"/>
               </w:rPr>
-              <w:t w:space="preserve" xml:space="preserve">AS </w:t>
+              <w:t w:space="preserve" xml:space="preserve">ES </w:t>
             </w:r>
             <w:r>
               <w:rPr>
@@ -13302,7 +13302,7 @@
                 <w:szCs w:val="14"/>
                 <w:rFonts w:ascii="Times New Roman" w:hAnsi="Times New Roman" w:cs="Times New Roman"/>
               </w:rPr>
-              <w:t w:space="preserve" xml:space="preserve">AS</w:t>
+              <w:t w:space="preserve" xml:space="preserve">ES</w:t>
             </w:r>
           </w:p>
         </w:tc>
@@ -13729,7 +13729,7 @@
                 <w:szCs w:val="14"/>
                 <w:rFonts w:ascii="Times New Roman" w:hAnsi="Times New Roman" w:cs="Times New Roman"/>
               </w:rPr>
-              <w:t w:space="preserve" xml:space="preserve">AS </w:t>
+              <w:t w:space="preserve" xml:space="preserve">ES </w:t>
             </w:r>
             <w:r>
               <w:rPr>
@@ -14124,7 +14124,7 @@
                 <w:szCs w:val="14"/>
                 <w:rFonts w:ascii="Times New Roman" w:hAnsi="Times New Roman" w:cs="Times New Roman"/>
               </w:rPr>
-              <w:t w:space="preserve" xml:space="preserve">AS </w:t>
+              <w:t w:space="preserve" xml:space="preserve">ES </w:t>
             </w:r>
             <w:r>
               <w:rPr>

</xml_diff>